<commit_message>
Finalize PVK Cinemas decision support and booking platform
</commit_message>
<xml_diff>
--- a/PVK_Cinemas_API_Specification.docx
+++ b/PVK_Cinemas_API_Specification.docx
@@ -547,7 +547,7 @@
         <w:pStyle w:val="ListBullet"/>
       </w:pPr>
       <w:r>
-        <w:t>No endpoint is added for explicitly excluded payment, settlement, loyalty, or marketplace functionality.</w:t>
+        <w:t>Endpoints are provided for internal simulated booking, 5-minute temporary seat holding, simulated checkout, and intelligent decision support. Real third-party payment gateways and commercial aggregator integrations remain strictly excluded.</w:t>
       </w:r>
     </w:p>
     <w:p>
@@ -7805,7 +7805,7 @@
     <w:p/>
     <w:p>
       <w:r>
-        <w:t>This endpoint is a display/availability operation. It is not a booking or payment endpoint.</w:t>
+        <w:t>This endpoint provides real-time seat inventory availability and AI seat quality scores, feeding directly into customer seat selection and temporary hold lifecycle.</w:t>
       </w:r>
     </w:p>
     <w:p>
@@ -13832,7 +13832,7 @@
         <w:pStyle w:val="ListBullet"/>
       </w:pPr>
       <w:r>
-        <w:t>No payment gateway endpoints.</w:t>
+        <w:t>No live commercial payment gateway endpoints (Simulated dummy payment checkout is supported via /api/v1/bookings/checkout).</w:t>
       </w:r>
     </w:p>
     <w:p>
@@ -13840,7 +13840,7 @@
         <w:pStyle w:val="ListBullet"/>
       </w:pPr>
       <w:r>
-        <w:t>No payment-method storage endpoints.</w:t>
+        <w:t>No real financial card or bank credential storage (Simulated payment references only).</w:t>
       </w:r>
     </w:p>
     <w:p>

</xml_diff>